<commit_message>
Updating errors, finishing fact sheet module
</commit_message>
<xml_diff>
--- a/TechComm/assignments/fact-sheet/fact-sheet-self-check-AIprompt.docx
+++ b/TechComm/assignments/fact-sheet/fact-sheet-self-check-AIprompt.docx
@@ -121,13 +121,105 @@
           <w:b/>
           <w:bCs/>
         </w:rPr>
-        <w:t>Format &amp; Length:</w:t>
+        <w:t>Project Topic &amp; Audience</w:t>
+      </w:r>
+      <w:r>
+        <w:rPr>
+          <w:rFonts w:ascii="Verdana" w:hAnsi="Verdana"/>
+          <w:b/>
+          <w:bCs/>
+        </w:rPr>
+        <w:t xml:space="preserve">: </w:t>
       </w:r>
       <w:r>
         <w:rPr>
           <w:rFonts w:ascii="Verdana" w:hAnsi="Verdana"/>
         </w:rPr>
-        <w:t xml:space="preserve"> My fact sheet meets all format and length requirements (one page, front and back, portrait layout, correct margins, and consistent design).</w:t>
+        <w:t>My fact sheet focuses on a technical object, principle, or idea that is covered in my informational report. My topic focuses on informational goals, providing an objective and balanced explanation. My report is addressed to specific non-expert users from a local community or group who are constituents of the decision-making audience from your informational report.</w:t>
+      </w:r>
+    </w:p>
+    <w:p>
+      <w:pPr>
+        <w:pStyle w:val="ListParagraph"/>
+        <w:numPr>
+          <w:ilvl w:val="0"/>
+          <w:numId w:val="10"/>
+        </w:numPr>
+        <w:spacing w:after="180"/>
+        <w:contextualSpacing w:val="0"/>
+        <w:rPr>
+          <w:rFonts w:ascii="Verdana" w:hAnsi="Verdana"/>
+        </w:rPr>
+      </w:pPr>
+      <w:r>
+        <w:rPr>
+          <w:rFonts w:ascii="Verdana" w:hAnsi="Verdana"/>
+          <w:b/>
+          <w:bCs/>
+        </w:rPr>
+        <w:t>Format, Length, &amp; First Impression</w:t>
+      </w:r>
+      <w:r>
+        <w:rPr>
+          <w:rFonts w:ascii="Verdana" w:hAnsi="Verdana"/>
+          <w:b/>
+          <w:bCs/>
+        </w:rPr>
+        <w:t xml:space="preserve">: </w:t>
+      </w:r>
+      <w:r>
+        <w:rPr>
+          <w:rFonts w:ascii="Verdana" w:hAnsi="Verdana"/>
+        </w:rPr>
+        <w:t xml:space="preserve">My fact sheet meets all format and length requirements. It is one page front and back (no more and no less). It </w:t>
+      </w:r>
+      <w:r>
+        <w:rPr>
+          <w:rFonts w:ascii="Verdana" w:hAnsi="Verdana"/>
+        </w:rPr>
+        <w:t xml:space="preserve">is </w:t>
+      </w:r>
+      <w:r>
+        <w:rPr>
+          <w:rFonts w:ascii="Verdana" w:hAnsi="Verdana"/>
+        </w:rPr>
+        <w:t xml:space="preserve">designed </w:t>
+      </w:r>
+      <w:r>
+        <w:rPr>
+          <w:rFonts w:ascii="Verdana" w:hAnsi="Verdana"/>
+        </w:rPr>
+        <w:t>for</w:t>
+      </w:r>
+      <w:r>
+        <w:rPr>
+          <w:rFonts w:ascii="Verdana" w:hAnsi="Verdana"/>
+        </w:rPr>
+        <w:t xml:space="preserve"> 8.5" by 11"</w:t>
+      </w:r>
+      <w:r>
+        <w:rPr>
+          <w:rFonts w:ascii="Verdana" w:hAnsi="Verdana"/>
+        </w:rPr>
+        <w:t xml:space="preserve"> paper</w:t>
+      </w:r>
+      <w:r>
+        <w:rPr>
+          <w:rFonts w:ascii="Verdana" w:hAnsi="Verdana"/>
+        </w:rPr>
+        <w:t xml:space="preserve"> and </w:t>
+      </w:r>
+      <w:r>
+        <w:rPr>
+          <w:rFonts w:ascii="Verdana" w:hAnsi="Verdana"/>
+        </w:rPr>
+        <w:t xml:space="preserve">laid out </w:t>
+      </w:r>
+      <w:r>
+        <w:rPr>
+          <w:rFonts w:ascii="Verdana" w:hAnsi="Verdana"/>
+        </w:rPr>
+        <w:t>in portrait layout with .5" to 1" margins. It makes a positive first impression as a polished, professional document.</w:t>
       </w:r>
     </w:p>
     <w:p>
@@ -155,7 +247,13 @@
         <w:rPr>
           <w:rFonts w:ascii="Verdana" w:hAnsi="Verdana"/>
         </w:rPr>
-        <w:t xml:space="preserve"> My fact sheet includes a clear, specific title, the current date, and my full name.</w:t>
+        <w:t xml:space="preserve"> </w:t>
+      </w:r>
+      <w:r>
+        <w:rPr>
+          <w:rFonts w:ascii="Verdana" w:hAnsi="Verdana"/>
+        </w:rPr>
+        <w:t>My fact sheet includes a clear, specific title, the current date, and my full name.</w:t>
       </w:r>
     </w:p>
     <w:p>
@@ -183,7 +281,25 @@
         <w:rPr>
           <w:rFonts w:ascii="Verdana" w:hAnsi="Verdana"/>
         </w:rPr>
-        <w:t xml:space="preserve"> My introduction clearly explains the topic, states why it matters, and outlines the key concepts or issues the fact sheet covers.</w:t>
+        <w:t xml:space="preserve"> </w:t>
+      </w:r>
+      <w:r>
+        <w:rPr>
+          <w:rFonts w:ascii="Verdana" w:hAnsi="Verdana"/>
+        </w:rPr>
+        <w:t>My introduction explains the topic clearly</w:t>
+      </w:r>
+      <w:r>
+        <w:rPr>
+          <w:rFonts w:ascii="Verdana" w:hAnsi="Verdana"/>
+        </w:rPr>
+        <w:t xml:space="preserve"> and </w:t>
+      </w:r>
+      <w:r>
+        <w:rPr>
+          <w:rFonts w:ascii="Verdana" w:hAnsi="Verdana"/>
+        </w:rPr>
+        <w:t>states why it matters, followed by a bullet list or outline of the key concepts or issues that will be addressed in the fact sheet.</w:t>
       </w:r>
     </w:p>
     <w:p>
@@ -211,7 +327,19 @@
         <w:rPr>
           <w:rFonts w:ascii="Verdana" w:hAnsi="Verdana"/>
         </w:rPr>
-        <w:t xml:space="preserve"> My fact sheet presents 3–5 essential facts in lists, short paragraphs, or data points. Each fact is well-selected, relevant, and fully explained.</w:t>
+        <w:t xml:space="preserve"> </w:t>
+      </w:r>
+      <w:r>
+        <w:rPr>
+          <w:rFonts w:ascii="Verdana" w:hAnsi="Verdana"/>
+        </w:rPr>
+        <w:t>My fact sheet arranges the information into distinct sections, presenting each section with a clear, informative heading followed by the most important facts about the topic. It explains 3–5 essential facts about the topic in lists, stats, and/or short paragraphs, combining these elements to communicate details fully.</w:t>
+      </w:r>
+      <w:r>
+        <w:rPr>
+          <w:rFonts w:ascii="Verdana" w:hAnsi="Verdana"/>
+        </w:rPr>
+        <w:t xml:space="preserve"> Each fact is well-selected, relevant, and fully explained.</w:t>
       </w:r>
     </w:p>
     <w:p>
@@ -239,7 +367,13 @@
         <w:rPr>
           <w:rFonts w:ascii="Verdana" w:hAnsi="Verdana"/>
         </w:rPr>
-        <w:t xml:space="preserve"> My conclusion summarizes the main ideas with quick facts, takeaways, or action steps that reinforce the message.</w:t>
+        <w:t xml:space="preserve"> </w:t>
+      </w:r>
+      <w:r>
+        <w:rPr>
+          <w:rFonts w:ascii="Verdana" w:hAnsi="Verdana"/>
+        </w:rPr>
+        <w:t>My conclusion summarizes the main points with quick facts, takeaways, or action steps relevant to readers.</w:t>
       </w:r>
     </w:p>
     <w:p>
@@ -267,7 +401,25 @@
         <w:rPr>
           <w:rFonts w:ascii="Verdana" w:hAnsi="Verdana"/>
         </w:rPr>
-        <w:t xml:space="preserve"> My fact sheet includes at least three visuals (including one data visualization and no more than one photo) that support understanding. Each visual has a two-part caption, is explained and referenced in the text, and is placed near its discussion.</w:t>
+        <w:t xml:space="preserve"> </w:t>
+      </w:r>
+      <w:r>
+        <w:rPr>
+          <w:rFonts w:ascii="Verdana" w:hAnsi="Verdana"/>
+        </w:rPr>
+        <w:t>My fact sheet integrates a minimum of 3 visuals—one of which is a data visualization and no more than one photo—that support understanding. Each</w:t>
+      </w:r>
+      <w:r>
+        <w:rPr>
+          <w:rFonts w:ascii="Verdana" w:hAnsi="Verdana"/>
+        </w:rPr>
+        <w:t xml:space="preserve"> </w:t>
+      </w:r>
+      <w:r>
+        <w:rPr>
+          <w:rFonts w:ascii="Verdana" w:hAnsi="Verdana"/>
+        </w:rPr>
+        <w:t>visual has a two-part caption, is explained and referenced in the text, and is placed near its discussion.</w:t>
       </w:r>
     </w:p>
     <w:p>
@@ -297,6 +449,12 @@
         </w:rPr>
         <w:t xml:space="preserve"> My fact sheet uses 6–10 credible sources that are integrated smoothly into the text. All in-text and bibliographic citations are correctly formatted in my discipline’s style.</w:t>
       </w:r>
+      <w:r>
+        <w:rPr>
+          <w:rFonts w:ascii="Verdana" w:hAnsi="Verdana"/>
+        </w:rPr>
+        <w:t xml:space="preserve"> </w:t>
+      </w:r>
     </w:p>
     <w:p>
       <w:pPr>
@@ -317,13 +475,32 @@
           <w:b/>
           <w:bCs/>
         </w:rPr>
+        <w:lastRenderedPageBreak/>
         <w:t>Plain Language Use:</w:t>
       </w:r>
       <w:r>
         <w:rPr>
           <w:rFonts w:ascii="Verdana" w:hAnsi="Verdana"/>
         </w:rPr>
-        <w:t xml:space="preserve"> My fact sheet explains technical information clearly for non-expert readers. It uses plain language and defines all necessary terms.</w:t>
+        <w:t xml:space="preserve"> </w:t>
+      </w:r>
+      <w:r>
+        <w:rPr>
+          <w:rFonts w:ascii="Verdana" w:hAnsi="Verdana"/>
+        </w:rPr>
+        <w:t>My fact sheet explains all information in plain language so non-expert readers can understand</w:t>
+      </w:r>
+      <w:r>
+        <w:rPr>
+          <w:rFonts w:ascii="Verdana" w:hAnsi="Verdana"/>
+        </w:rPr>
+        <w:t>. It includes</w:t>
+      </w:r>
+      <w:r>
+        <w:rPr>
+          <w:rFonts w:ascii="Verdana" w:hAnsi="Verdana"/>
+        </w:rPr>
+        <w:t xml:space="preserve"> clear explanations and definitions for any technical terms.</w:t>
       </w:r>
     </w:p>
     <w:p>
@@ -351,7 +528,13 @@
         <w:rPr>
           <w:rFonts w:ascii="Verdana" w:hAnsi="Verdana"/>
         </w:rPr>
-        <w:t xml:space="preserve"> My design applies CRAP principles (Contrast, Repetition, Alignment, Proximity) and uses headings, fonts, spacing, and chunking to make the document easy to read and visually appealing.</w:t>
+        <w:t xml:space="preserve"> </w:t>
+      </w:r>
+      <w:r>
+        <w:rPr>
+          <w:rFonts w:ascii="Verdana" w:hAnsi="Verdana"/>
+        </w:rPr>
+        <w:t>My document design uses headings, logical structure, and visual hierarchy to guide readers through the document. Uses CRAP design principles (contrast, repetition, alignment, proximity), fonts, chunking, and other formatting elements effectively to increase readability.</w:t>
       </w:r>
     </w:p>
     <w:p>
@@ -1450,7 +1633,6 @@
   <w:style w:type="character" w:default="1" w:styleId="DefaultParagraphFont">
     <w:name w:val="Default Paragraph Font"/>
     <w:uiPriority w:val="1"/>
-    <w:semiHidden/>
     <w:unhideWhenUsed/>
   </w:style>
   <w:style w:type="table" w:default="1" w:styleId="TableNormal">

</xml_diff>